<commit_message>
Lab 3: UTM title page with logo
</commit_message>
<xml_diff>
--- a/lab3/Lab3_AdrianMutu_FAF-242.docx
+++ b/lab3/Lab3_AdrianMutu_FAF-242.docx
@@ -4,151 +4,236 @@
   <w:body>
     <w:p>
       <w:pPr>
-        <w:spacing w:after="60"/>
-        <w:jc w:val="center"/>
-      </w:pPr>
-      <w:r>
-        <w:rPr>
+        <w:spacing w:after="360"/>
+        <w:jc w:val="center"/>
+      </w:pPr>
+      <w:r>
+        <w:drawing>
+          <wp:inline distT="0" distB="0" distL="0" distR="0">
+            <wp:extent cx="1771650" cy="914400"/>
+            <wp:effectExtent l="0" t="0" r="0" b="0"/>
+            <wp:docPr id="900" name="UTM logo"/>
+            <wp:cNvGraphicFramePr>
+              <a:graphicFrameLocks xmlns:a="http://schemas.openxmlformats.org/drawingml/2006/main" noChangeAspect="1"/>
+            </wp:cNvGraphicFramePr>
+            <a:graphic xmlns:a="http://schemas.openxmlformats.org/drawingml/2006/main">
+              <a:graphicData uri="http://schemas.openxmlformats.org/drawingml/2006/picture">
+                <pic:pic xmlns:pic="http://schemas.openxmlformats.org/drawingml/2006/picture">
+                  <pic:nvPicPr>
+                    <pic:cNvPr id="900" name="UTM logo"/>
+                    <pic:cNvPicPr/>
+                  </pic:nvPicPr>
+                  <pic:blipFill>
+                    <a:blip r:embed="rId100"/>
+                    <a:stretch>
+                      <a:fillRect/>
+                    </a:stretch>
+                  </pic:blipFill>
+                  <pic:spPr>
+                    <a:xfrm>
+                      <a:off x="0" y="0"/>
+                      <a:ext cx="1771650" cy="914400"/>
+                    </a:xfrm>
+                    <a:prstGeom prst="rect">
+                      <a:avLst/>
+                    </a:prstGeom>
+                  </pic:spPr>
+                </pic:pic>
+              </a:graphicData>
+            </a:graphic>
+          </wp:inline>
+        </w:drawing>
+      </w:r>
+    </w:p>
+    <w:p>
+      <w:pPr>
+        <w:spacing w:after="80"/>
+        <w:jc w:val="center"/>
+      </w:pPr>
+      <w:r>
+        <w:rPr>
+          <w:b/>
+          <w:sz w:val="26"/>
+          <w:szCs w:val="26"/>
+        </w:rPr>
+        <w:t xml:space="preserve">MINISTRY OF EDUCATION AND RESEARCH OF THE REPUBLIC OF MOLDOVA</w:t>
+      </w:r>
+    </w:p>
+    <w:p>
+      <w:pPr>
+        <w:spacing w:after="80"/>
+        <w:jc w:val="center"/>
+      </w:pPr>
+      <w:r>
+        <w:rPr>
+          <w:b/>
           <w:sz w:val="24"/>
           <w:szCs w:val="24"/>
         </w:rPr>
-        <w:t xml:space="preserve">MINISTRY OF EDUCATION AND RESEARCH OF THE REPUBLIC OF MOLDOVA</w:t>
-      </w:r>
-    </w:p>
-    <w:p>
-      <w:pPr>
-        <w:spacing w:after="60"/>
-        <w:jc w:val="center"/>
-      </w:pPr>
-      <w:r>
-        <w:rPr>
-          <w:b/>
-          <w:bCs/>
+        <w:t xml:space="preserve">Technical University of Moldova</w:t>
+      </w:r>
+    </w:p>
+    <w:p>
+      <w:pPr>
+        <w:spacing w:after="80"/>
+        <w:jc w:val="center"/>
+      </w:pPr>
+      <w:r>
+        <w:rPr>
+          <w:b/>
+          <w:sz w:val="24"/>
+          <w:szCs w:val="24"/>
+        </w:rPr>
+        <w:t xml:space="preserve">Faculty of Computers, Informatics and Microelectronics</w:t>
+      </w:r>
+    </w:p>
+    <w:p>
+      <w:pPr>
+        <w:spacing w:after="2200"/>
+        <w:jc w:val="center"/>
+      </w:pPr>
+      <w:r>
+        <w:rPr>
+          <w:b/>
+          <w:sz w:val="24"/>
+          <w:szCs w:val="24"/>
+        </w:rPr>
+        <w:t xml:space="preserve">Department of Software Engineering and Automation</w:t>
+      </w:r>
+    </w:p>
+    <w:p>
+      <w:pPr>
+        <w:spacing w:after="160"/>
+        <w:jc w:val="center"/>
+      </w:pPr>
+      <w:r>
+        <w:rPr>
           <w:sz w:val="26"/>
           <w:szCs w:val="26"/>
         </w:rPr>
-        <w:t xml:space="preserve">Technical University of Moldova</w:t>
+        <w:t xml:space="preserve">Adrian Mutu</w:t>
+      </w:r>
+    </w:p>
+    <w:p>
+      <w:pPr>
+        <w:spacing w:after="1400"/>
+        <w:jc w:val="center"/>
+      </w:pPr>
+      <w:r>
+        <w:rPr>
+          <w:sz w:val="26"/>
+          <w:szCs w:val="26"/>
+        </w:rPr>
+        <w:t xml:space="preserve">Group: FAF-242</w:t>
       </w:r>
     </w:p>
     <w:p>
       <w:pPr>
         <w:spacing w:after="60"/>
         <w:jc w:val="center"/>
+      </w:pPr>
+      <w:r>
+        <w:rPr>
+          <w:b/>
+          <w:sz w:val="36"/>
+          <w:szCs w:val="36"/>
+        </w:rPr>
+        <w:t xml:space="preserve">Report</w:t>
+      </w:r>
+    </w:p>
+    <w:p>
+      <w:pPr>
+        <w:spacing w:after="200"/>
+        <w:jc w:val="center"/>
+      </w:pPr>
+      <w:r>
+        <w:rPr>
+          <w:i/>
+          <w:sz w:val="30"/>
+          <w:szCs w:val="30"/>
+        </w:rPr>
+        <w:t xml:space="preserve">Laboratory Work No. 3</w:t>
+      </w:r>
+    </w:p>
+    <w:p>
+      <w:pPr>
+        <w:spacing w:after="300"/>
+        <w:jc w:val="center"/>
+      </w:pPr>
+      <w:r>
+        <w:rPr>
+          <w:b/>
+          <w:sz w:val="28"/>
+          <w:szCs w:val="28"/>
+        </w:rPr>
+        <w:t xml:space="preserve">Operating Systems</w:t>
+      </w:r>
+    </w:p>
+    <w:p>
+      <w:pPr>
+        <w:spacing w:after="2400"/>
+        <w:jc w:val="center"/>
+      </w:pPr>
+      <w:r>
+        <w:rPr>
+          <w:sz w:val="26"/>
+          <w:szCs w:val="26"/>
+        </w:rPr>
+        <w:t xml:space="preserve">Topic: The Command Line — Shell, Pipes and Text Filters</w:t>
+      </w:r>
+    </w:p>
+    <w:p>
+      <w:pPr>
+        <w:spacing w:after="60"/>
+        <w:jc w:val="right"/>
       </w:pPr>
       <w:r>
         <w:rPr>
           <w:sz w:val="24"/>
           <w:szCs w:val="24"/>
         </w:rPr>
-        <w:t xml:space="preserve">Faculty of Computers, Informatics and Microelectronics</w:t>
-      </w:r>
-    </w:p>
-    <w:p>
-      <w:pPr>
-        <w:spacing w:after="1800"/>
-        <w:jc w:val="center"/>
-      </w:pPr>
-      <w:r>
-        <w:rPr>
+        <w:t xml:space="preserve">Checked by:</w:t>
+      </w:r>
+    </w:p>
+    <w:p>
+      <w:pPr>
+        <w:spacing w:after="60"/>
+        <w:jc w:val="right"/>
+      </w:pPr>
+      <w:r>
+        <w:rPr>
+          <w:b/>
           <w:sz w:val="24"/>
           <w:szCs w:val="24"/>
         </w:rPr>
-        <w:t xml:space="preserve">Department of Software Engineering and Automation</w:t>
-      </w:r>
-    </w:p>
-    <w:p>
-      <w:pPr>
-        <w:spacing w:after="120"/>
-        <w:jc w:val="center"/>
-      </w:pPr>
-      <w:r>
-        <w:rPr>
-          <w:b/>
-          <w:bCs/>
-          <w:sz w:val="40"/>
-          <w:szCs w:val="40"/>
-        </w:rPr>
-        <w:t xml:space="preserve">REPORT</w:t>
-      </w:r>
-    </w:p>
-    <w:p>
-      <w:pPr>
-        <w:spacing w:after="60"/>
-        <w:jc w:val="center"/>
-      </w:pPr>
-      <w:r>
-        <w:rPr>
-          <w:sz w:val="28"/>
-          <w:szCs w:val="28"/>
-        </w:rPr>
-        <w:t xml:space="preserve">on laboratory work no. 3</w:t>
-      </w:r>
-    </w:p>
-    <w:p>
-      <w:pPr>
-        <w:spacing w:after="240"/>
-        <w:jc w:val="center"/>
-      </w:pPr>
-      <w:r>
-        <w:rPr>
-          <w:sz w:val="28"/>
-          <w:szCs w:val="28"/>
-        </w:rPr>
-        <w:t xml:space="preserve">Operating Systems</w:t>
-      </w:r>
-    </w:p>
-    <w:p>
-      <w:pPr>
-        <w:spacing w:after="2000"/>
-        <w:jc w:val="center"/>
-      </w:pPr>
-      <w:r>
-        <w:rPr>
-          <w:b/>
-          <w:bCs/>
+        <w:t xml:space="preserve">Patricia Reitman</w:t>
+      </w:r>
+    </w:p>
+    <w:p>
+      <w:pPr>
+        <w:spacing w:after="1600"/>
+        <w:jc w:val="right"/>
+      </w:pPr>
+      <w:r>
+        <w:rPr>
+          <w:sz w:val="24"/>
+          <w:szCs w:val="24"/>
+        </w:rPr>
+        <w:t xml:space="preserve">FCIM, UTM</w:t>
+      </w:r>
+    </w:p>
+    <w:p>
+      <w:pPr>
+        <w:spacing w:after="80"/>
+        <w:jc w:val="center"/>
+      </w:pPr>
+      <w:r>
+        <w:rPr>
+          <w:b/>
           <w:sz w:val="26"/>
           <w:szCs w:val="26"/>
         </w:rPr>
-        <w:t xml:space="preserve">Topic: The Command Line — Shell, Pipes and Text Filters</w:t>
-      </w:r>
-    </w:p>
-    <w:p>
-      <w:pPr>
-        <w:spacing w:after="120"/>
-        <w:jc w:val="right"/>
-      </w:pPr>
-      <w:r>
-        <w:rPr>
-          <w:sz w:val="26"/>
-          <w:szCs w:val="26"/>
-        </w:rPr>
-        <w:t xml:space="preserve">Done by: st. gr. FAF-242, Adrian Mutu</w:t>
-      </w:r>
-    </w:p>
-    <w:p>
-      <w:pPr>
-        <w:spacing w:after="2600"/>
-        <w:jc w:val="right"/>
-      </w:pPr>
-      <w:r>
-        <w:rPr>
-          <w:sz w:val="26"/>
-          <w:szCs w:val="26"/>
-        </w:rPr>
-        <w:t xml:space="preserve">Checked by: Patricia Reitman</w:t>
-      </w:r>
-    </w:p>
-    <w:p>
-      <w:pPr>
-        <w:spacing w:after="60"/>
-        <w:jc w:val="center"/>
-      </w:pPr>
-      <w:r>
-        <w:rPr>
-          <w:sz w:val="26"/>
-          <w:szCs w:val="26"/>
-        </w:rPr>
-        <w:t xml:space="preserve">Chișinău, 2026</w:t>
+        <w:t xml:space="preserve">Chișinău – 2026</w:t>
       </w:r>
     </w:p>
     <w:p>

</xml_diff>

<commit_message>
Clean figure styling in reports
</commit_message>
<xml_diff>
--- a/lab3/Lab3_AdrianMutu_FAF-242.docx
+++ b/lab3/Lab3_AdrianMutu_FAF-242.docx
@@ -381,7 +381,7 @@
       <w:r>
         <w:drawing>
           <wp:inline distT="0" distB="0" distL="0" distR="0">
-            <wp:extent cx="4095750" cy="1343025"/>
+            <wp:extent cx="4095750" cy="1124054"/>
             <wp:effectExtent t="0" r="0" b="0" l="0"/>
             <wp:docPr id="1" name="" descr="" title=""/>
             <wp:cNvGraphicFramePr>
@@ -406,7 +406,7 @@
                   <pic:spPr bwMode="auto">
                     <a:xfrm>
                       <a:off x="0" y="0"/>
-                      <a:ext cx="4095750" cy="1343025"/>
+                      <a:ext cx="4095750" cy="1124054"/>
                     </a:xfrm>
                     <a:prstGeom prst="rect">
                       <a:avLst/>
@@ -510,7 +510,7 @@
       <w:r>
         <w:drawing>
           <wp:inline distT="0" distB="0" distL="0" distR="0">
-            <wp:extent cx="4095750" cy="2190750"/>
+            <wp:extent cx="4095750" cy="1978742"/>
             <wp:effectExtent t="0" r="0" b="0" l="0"/>
             <wp:docPr id="2" name="" descr="" title=""/>
             <wp:cNvGraphicFramePr>
@@ -535,7 +535,7 @@
                   <pic:spPr bwMode="auto">
                     <a:xfrm>
                       <a:off x="0" y="0"/>
-                      <a:ext cx="4095750" cy="2190750"/>
+                      <a:ext cx="4095750" cy="1978742"/>
                     </a:xfrm>
                     <a:prstGeom prst="rect">
                       <a:avLst/>
@@ -632,7 +632,7 @@
       <w:r>
         <w:drawing>
           <wp:inline distT="0" distB="0" distL="0" distR="0">
-            <wp:extent cx="4095750" cy="1809750"/>
+            <wp:extent cx="4095750" cy="1589942"/>
             <wp:effectExtent t="0" r="0" b="0" l="0"/>
             <wp:docPr id="3" name="" descr="" title=""/>
             <wp:cNvGraphicFramePr>
@@ -657,7 +657,7 @@
                   <pic:spPr bwMode="auto">
                     <a:xfrm>
                       <a:off x="0" y="0"/>
-                      <a:ext cx="4095750" cy="1809750"/>
+                      <a:ext cx="4095750" cy="1589942"/>
                     </a:xfrm>
                     <a:prstGeom prst="rect">
                       <a:avLst/>
@@ -706,7 +706,7 @@
       <w:r>
         <w:drawing>
           <wp:inline distT="0" distB="0" distL="0" distR="0">
-            <wp:extent cx="4095750" cy="1657350"/>
+            <wp:extent cx="4095750" cy="1437348"/>
             <wp:effectExtent t="0" r="0" b="0" l="0"/>
             <wp:docPr id="4" name="" descr="" title=""/>
             <wp:cNvGraphicFramePr>
@@ -731,7 +731,7 @@
                   <pic:spPr bwMode="auto">
                     <a:xfrm>
                       <a:off x="0" y="0"/>
-                      <a:ext cx="4095750" cy="1657350"/>
+                      <a:ext cx="4095750" cy="1437348"/>
                     </a:xfrm>
                     <a:prstGeom prst="rect">
                       <a:avLst/>
@@ -767,7 +767,7 @@
       <w:r>
         <w:drawing>
           <wp:inline distT="0" distB="0" distL="0" distR="0">
-            <wp:extent cx="4095750" cy="1552575"/>
+            <wp:extent cx="4095750" cy="1420253"/>
             <wp:effectExtent t="0" r="0" b="0" l="0"/>
             <wp:docPr id="5" name="" descr="" title=""/>
             <wp:cNvGraphicFramePr>
@@ -792,7 +792,7 @@
                   <pic:spPr bwMode="auto">
                     <a:xfrm>
                       <a:off x="0" y="0"/>
-                      <a:ext cx="4095750" cy="1552575"/>
+                      <a:ext cx="4095750" cy="1420253"/>
                     </a:xfrm>
                     <a:prstGeom prst="rect">
                       <a:avLst/>
@@ -828,7 +828,7 @@
       <w:r>
         <w:drawing>
           <wp:inline distT="0" distB="0" distL="0" distR="0">
-            <wp:extent cx="4095750" cy="885825"/>
+            <wp:extent cx="4095750" cy="666199"/>
             <wp:effectExtent t="0" r="0" b="0" l="0"/>
             <wp:docPr id="6" name="" descr="" title=""/>
             <wp:cNvGraphicFramePr>
@@ -853,7 +853,7 @@
                   <pic:spPr bwMode="auto">
                     <a:xfrm>
                       <a:off x="0" y="0"/>
-                      <a:ext cx="4095750" cy="885825"/>
+                      <a:ext cx="4095750" cy="666199"/>
                     </a:xfrm>
                     <a:prstGeom prst="rect">
                       <a:avLst/>
@@ -889,7 +889,7 @@
       <w:r>
         <w:drawing>
           <wp:inline distT="0" distB="0" distL="0" distR="0">
-            <wp:extent cx="4095750" cy="1924050"/>
+            <wp:extent cx="4095750" cy="1737852"/>
             <wp:effectExtent t="0" r="0" b="0" l="0"/>
             <wp:docPr id="7" name="" descr="" title=""/>
             <wp:cNvGraphicFramePr>
@@ -914,7 +914,7 @@
                   <pic:spPr bwMode="auto">
                     <a:xfrm>
                       <a:off x="0" y="0"/>
-                      <a:ext cx="4095750" cy="1924050"/>
+                      <a:ext cx="4095750" cy="1737852"/>
                     </a:xfrm>
                     <a:prstGeom prst="rect">
                       <a:avLst/>
@@ -1223,7 +1223,7 @@
       <w:r>
         <w:drawing>
           <wp:inline distT="0" distB="0" distL="0" distR="0">
-            <wp:extent cx="4095750" cy="1962150"/>
+            <wp:extent cx="4095750" cy="1742506"/>
             <wp:effectExtent t="0" r="0" b="0" l="0"/>
             <wp:docPr id="8" name="" descr="" title=""/>
             <wp:cNvGraphicFramePr>
@@ -1248,7 +1248,7 @@
                   <pic:spPr bwMode="auto">
                     <a:xfrm>
                       <a:off x="0" y="0"/>
-                      <a:ext cx="4095750" cy="1962150"/>
+                      <a:ext cx="4095750" cy="1742506"/>
                     </a:xfrm>
                     <a:prstGeom prst="rect">
                       <a:avLst/>
@@ -2325,7 +2325,7 @@
       <w:r>
         <w:drawing>
           <wp:inline distT="0" distB="0" distL="0" distR="0">
-            <wp:extent cx="4095750" cy="1657350"/>
+            <wp:extent cx="4095750" cy="1437348"/>
             <wp:effectExtent t="0" r="0" b="0" l="0"/>
             <wp:docPr id="9" name="" descr="" title=""/>
             <wp:cNvGraphicFramePr>
@@ -2350,7 +2350,7 @@
                   <pic:spPr bwMode="auto">
                     <a:xfrm>
                       <a:off x="0" y="0"/>
-                      <a:ext cx="4095750" cy="1657350"/>
+                      <a:ext cx="4095750" cy="1437348"/>
                     </a:xfrm>
                     <a:prstGeom prst="rect">
                       <a:avLst/>
@@ -2386,7 +2386,7 @@
       <w:r>
         <w:drawing>
           <wp:inline distT="0" distB="0" distL="0" distR="0">
-            <wp:extent cx="4095750" cy="1495425"/>
+            <wp:extent cx="4095750" cy="1276582"/>
             <wp:effectExtent t="0" r="0" b="0" l="0"/>
             <wp:docPr id="10" name="" descr="" title=""/>
             <wp:cNvGraphicFramePr>
@@ -2411,7 +2411,7 @@
                   <pic:spPr bwMode="auto">
                     <a:xfrm>
                       <a:off x="0" y="0"/>
-                      <a:ext cx="4095750" cy="1495425"/>
+                      <a:ext cx="4095750" cy="1276582"/>
                     </a:xfrm>
                     <a:prstGeom prst="rect">
                       <a:avLst/>
@@ -2447,7 +2447,7 @@
       <w:r>
         <w:drawing>
           <wp:inline distT="0" distB="0" distL="0" distR="0">
-            <wp:extent cx="4095750" cy="2114550"/>
+            <wp:extent cx="4095750" cy="1895047"/>
             <wp:effectExtent t="0" r="0" b="0" l="0"/>
             <wp:docPr id="11" name="" descr="" title=""/>
             <wp:cNvGraphicFramePr>
@@ -2472,7 +2472,7 @@
                   <pic:spPr bwMode="auto">
                     <a:xfrm>
                       <a:off x="0" y="0"/>
-                      <a:ext cx="4095750" cy="2114550"/>
+                      <a:ext cx="4095750" cy="1895047"/>
                     </a:xfrm>
                     <a:prstGeom prst="rect">
                       <a:avLst/>
@@ -2766,7 +2766,7 @@
       <w:r>
         <w:drawing>
           <wp:inline distT="0" distB="0" distL="0" distR="0">
-            <wp:extent cx="4095750" cy="1038225"/>
+            <wp:extent cx="4095750" cy="818882"/>
             <wp:effectExtent t="0" r="0" b="0" l="0"/>
             <wp:docPr id="12" name="" descr="" title=""/>
             <wp:cNvGraphicFramePr>
@@ -2791,7 +2791,7 @@
                   <pic:spPr bwMode="auto">
                     <a:xfrm>
                       <a:off x="0" y="0"/>
-                      <a:ext cx="4095750" cy="1038225"/>
+                      <a:ext cx="4095750" cy="818882"/>
                     </a:xfrm>
                     <a:prstGeom prst="rect">
                       <a:avLst/>
@@ -2827,7 +2827,7 @@
       <w:r>
         <w:drawing>
           <wp:inline distT="0" distB="0" distL="0" distR="0">
-            <wp:extent cx="4095750" cy="2114550"/>
+            <wp:extent cx="4095750" cy="1895047"/>
             <wp:effectExtent t="0" r="0" b="0" l="0"/>
             <wp:docPr id="13" name="" descr="" title=""/>
             <wp:cNvGraphicFramePr>
@@ -2852,7 +2852,7 @@
                   <pic:spPr bwMode="auto">
                     <a:xfrm>
                       <a:off x="0" y="0"/>
-                      <a:ext cx="4095750" cy="2114550"/>
+                      <a:ext cx="4095750" cy="1895047"/>
                     </a:xfrm>
                     <a:prstGeom prst="rect">
                       <a:avLst/>
@@ -2888,7 +2888,7 @@
       <w:r>
         <w:drawing>
           <wp:inline distT="0" distB="0" distL="0" distR="0">
-            <wp:extent cx="4095750" cy="1619250"/>
+            <wp:extent cx="4095750" cy="1422580"/>
             <wp:effectExtent t="0" r="0" b="0" l="0"/>
             <wp:docPr id="14" name="" descr="" title=""/>
             <wp:cNvGraphicFramePr>
@@ -2913,7 +2913,7 @@
                   <pic:spPr bwMode="auto">
                     <a:xfrm>
                       <a:off x="0" y="0"/>
-                      <a:ext cx="4095750" cy="1619250"/>
+                      <a:ext cx="4095750" cy="1422580"/>
                     </a:xfrm>
                     <a:prstGeom prst="rect">
                       <a:avLst/>
@@ -2949,7 +2949,7 @@
       <w:r>
         <w:drawing>
           <wp:inline distT="0" distB="0" distL="0" distR="0">
-            <wp:extent cx="4095750" cy="1190625"/>
+            <wp:extent cx="4095750" cy="971492"/>
             <wp:effectExtent t="0" r="0" b="0" l="0"/>
             <wp:docPr id="15" name="" descr="" title=""/>
             <wp:cNvGraphicFramePr>
@@ -2974,7 +2974,7 @@
                   <pic:spPr bwMode="auto">
                     <a:xfrm>
                       <a:off x="0" y="0"/>
-                      <a:ext cx="4095750" cy="1190625"/>
+                      <a:ext cx="4095750" cy="971492"/>
                     </a:xfrm>
                     <a:prstGeom prst="rect">
                       <a:avLst/>
@@ -3246,7 +3246,7 @@
       <w:r>
         <w:drawing>
           <wp:inline distT="0" distB="0" distL="0" distR="0">
-            <wp:extent cx="4095750" cy="733425"/>
+            <wp:extent cx="4095750" cy="513398"/>
             <wp:effectExtent t="0" r="0" b="0" l="0"/>
             <wp:docPr id="16" name="" descr="" title=""/>
             <wp:cNvGraphicFramePr>
@@ -3271,7 +3271,7 @@
                   <pic:spPr bwMode="auto">
                     <a:xfrm>
                       <a:off x="0" y="0"/>
-                      <a:ext cx="4095750" cy="733425"/>
+                      <a:ext cx="4095750" cy="513398"/>
                     </a:xfrm>
                     <a:prstGeom prst="rect">
                       <a:avLst/>
@@ -3307,7 +3307,7 @@
       <w:r>
         <w:drawing>
           <wp:inline distT="0" distB="0" distL="0" distR="0">
-            <wp:extent cx="4095750" cy="1190625"/>
+            <wp:extent cx="4095750" cy="971492"/>
             <wp:effectExtent t="0" r="0" b="0" l="0"/>
             <wp:docPr id="17" name="" descr="" title=""/>
             <wp:cNvGraphicFramePr>
@@ -3332,7 +3332,7 @@
                   <pic:spPr bwMode="auto">
                     <a:xfrm>
                       <a:off x="0" y="0"/>
-                      <a:ext cx="4095750" cy="1190625"/>
+                      <a:ext cx="4095750" cy="971492"/>
                     </a:xfrm>
                     <a:prstGeom prst="rect">
                       <a:avLst/>
@@ -3368,7 +3368,7 @@
       <w:r>
         <w:drawing>
           <wp:inline distT="0" distB="0" distL="0" distR="0">
-            <wp:extent cx="4095750" cy="1190625"/>
+            <wp:extent cx="4095750" cy="971492"/>
             <wp:effectExtent t="0" r="0" b="0" l="0"/>
             <wp:docPr id="18" name="" descr="" title=""/>
             <wp:cNvGraphicFramePr>
@@ -3393,7 +3393,7 @@
                   <pic:spPr bwMode="auto">
                     <a:xfrm>
                       <a:off x="0" y="0"/>
-                      <a:ext cx="4095750" cy="1190625"/>
+                      <a:ext cx="4095750" cy="971492"/>
                     </a:xfrm>
                     <a:prstGeom prst="rect">
                       <a:avLst/>
@@ -3429,7 +3429,7 @@
       <w:r>
         <w:drawing>
           <wp:inline distT="0" distB="0" distL="0" distR="0">
-            <wp:extent cx="4095750" cy="790575"/>
+            <wp:extent cx="4095750" cy="623552"/>
             <wp:effectExtent t="0" r="0" b="0" l="0"/>
             <wp:docPr id="19" name="" descr="" title=""/>
             <wp:cNvGraphicFramePr>
@@ -3454,7 +3454,7 @@
                   <pic:spPr bwMode="auto">
                     <a:xfrm>
                       <a:off x="0" y="0"/>
-                      <a:ext cx="4095750" cy="790575"/>
+                      <a:ext cx="4095750" cy="623552"/>
                     </a:xfrm>
                     <a:prstGeom prst="rect">
                       <a:avLst/>
@@ -3490,7 +3490,7 @@
       <w:r>
         <w:drawing>
           <wp:inline distT="0" distB="0" distL="0" distR="0">
-            <wp:extent cx="4095750" cy="742950"/>
+            <wp:extent cx="4095750" cy="558748"/>
             <wp:effectExtent t="0" r="0" b="0" l="0"/>
             <wp:docPr id="20" name="" descr="" title=""/>
             <wp:cNvGraphicFramePr>
@@ -3515,7 +3515,7 @@
                   <pic:spPr bwMode="auto">
                     <a:xfrm>
                       <a:off x="0" y="0"/>
-                      <a:ext cx="4095750" cy="742950"/>
+                      <a:ext cx="4095750" cy="558748"/>
                     </a:xfrm>
                     <a:prstGeom prst="rect">
                       <a:avLst/>
@@ -3551,7 +3551,7 @@
       <w:r>
         <w:drawing>
           <wp:inline distT="0" distB="0" distL="0" distR="0">
-            <wp:extent cx="4095750" cy="1038225"/>
+            <wp:extent cx="4095750" cy="818882"/>
             <wp:effectExtent t="0" r="0" b="0" l="0"/>
             <wp:docPr id="21" name="" descr="" title=""/>
             <wp:cNvGraphicFramePr>
@@ -3576,7 +3576,7 @@
                   <pic:spPr bwMode="auto">
                     <a:xfrm>
                       <a:off x="0" y="0"/>
-                      <a:ext cx="4095750" cy="1038225"/>
+                      <a:ext cx="4095750" cy="818882"/>
                     </a:xfrm>
                     <a:prstGeom prst="rect">
                       <a:avLst/>
@@ -3612,7 +3612,7 @@
       <w:r>
         <w:drawing>
           <wp:inline distT="0" distB="0" distL="0" distR="0">
-            <wp:extent cx="4095750" cy="1190625"/>
+            <wp:extent cx="4095750" cy="971492"/>
             <wp:effectExtent t="0" r="0" b="0" l="0"/>
             <wp:docPr id="22" name="" descr="" title=""/>
             <wp:cNvGraphicFramePr>
@@ -3637,7 +3637,7 @@
                   <pic:spPr bwMode="auto">
                     <a:xfrm>
                       <a:off x="0" y="0"/>
-                      <a:ext cx="4095750" cy="1190625"/>
+                      <a:ext cx="4095750" cy="971492"/>
                     </a:xfrm>
                     <a:prstGeom prst="rect">
                       <a:avLst/>
@@ -3673,7 +3673,7 @@
       <w:r>
         <w:drawing>
           <wp:inline distT="0" distB="0" distL="0" distR="0">
-            <wp:extent cx="4095750" cy="885825"/>
+            <wp:extent cx="4095750" cy="666199"/>
             <wp:effectExtent t="0" r="0" b="0" l="0"/>
             <wp:docPr id="23" name="" descr="" title=""/>
             <wp:cNvGraphicFramePr>
@@ -3698,7 +3698,7 @@
                   <pic:spPr bwMode="auto">
                     <a:xfrm>
                       <a:off x="0" y="0"/>
-                      <a:ext cx="4095750" cy="885825"/>
+                      <a:ext cx="4095750" cy="666199"/>
                     </a:xfrm>
                     <a:prstGeom prst="rect">
                       <a:avLst/>
@@ -3734,7 +3734,7 @@
       <w:r>
         <w:drawing>
           <wp:inline distT="0" distB="0" distL="0" distR="0">
-            <wp:extent cx="4095750" cy="4267200"/>
+            <wp:extent cx="4095750" cy="4047619"/>
             <wp:effectExtent t="0" r="0" b="0" l="0"/>
             <wp:docPr id="24" name="" descr="" title=""/>
             <wp:cNvGraphicFramePr>
@@ -3759,7 +3759,7 @@
                   <pic:spPr bwMode="auto">
                     <a:xfrm>
                       <a:off x="0" y="0"/>
-                      <a:ext cx="4095750" cy="4267200"/>
+                      <a:ext cx="4095750" cy="4047619"/>
                     </a:xfrm>
                     <a:prstGeom prst="rect">
                       <a:avLst/>
@@ -3795,7 +3795,7 @@
       <w:r>
         <w:drawing>
           <wp:inline distT="0" distB="0" distL="0" distR="0">
-            <wp:extent cx="4095750" cy="1647825"/>
+            <wp:extent cx="4095750" cy="1429087"/>
             <wp:effectExtent t="0" r="0" b="0" l="0"/>
             <wp:docPr id="25" name="" descr="" title=""/>
             <wp:cNvGraphicFramePr>
@@ -3820,7 +3820,7 @@
                   <pic:spPr bwMode="auto">
                     <a:xfrm>
                       <a:off x="0" y="0"/>
-                      <a:ext cx="4095750" cy="1647825"/>
+                      <a:ext cx="4095750" cy="1429087"/>
                     </a:xfrm>
                     <a:prstGeom prst="rect">
                       <a:avLst/>
@@ -3856,7 +3856,7 @@
       <w:r>
         <w:drawing>
           <wp:inline distT="0" distB="0" distL="0" distR="0">
-            <wp:extent cx="4095750" cy="638175"/>
+            <wp:extent cx="4095750" cy="503349"/>
             <wp:effectExtent t="0" r="0" b="0" l="0"/>
             <wp:docPr id="26" name="" descr="" title=""/>
             <wp:cNvGraphicFramePr>
@@ -3881,7 +3881,7 @@
                   <pic:spPr bwMode="auto">
                     <a:xfrm>
                       <a:off x="0" y="0"/>
-                      <a:ext cx="4095750" cy="638175"/>
+                      <a:ext cx="4095750" cy="503349"/>
                     </a:xfrm>
                     <a:prstGeom prst="rect">
                       <a:avLst/>
@@ -4331,7 +4331,7 @@
       <w:r>
         <w:drawing>
           <wp:inline distT="0" distB="0" distL="0" distR="0">
-            <wp:extent cx="4095750" cy="2886075"/>
+            <wp:extent cx="4095750" cy="2666323"/>
             <wp:effectExtent t="0" r="0" b="0" l="0"/>
             <wp:docPr id="27" name="" descr="" title=""/>
             <wp:cNvGraphicFramePr>
@@ -4356,7 +4356,7 @@
                   <pic:spPr bwMode="auto">
                     <a:xfrm>
                       <a:off x="0" y="0"/>
-                      <a:ext cx="4095750" cy="2886075"/>
+                      <a:ext cx="4095750" cy="2666323"/>
                     </a:xfrm>
                     <a:prstGeom prst="rect">
                       <a:avLst/>
@@ -4392,7 +4392,7 @@
       <w:r>
         <w:drawing>
           <wp:inline distT="0" distB="0" distL="0" distR="0">
-            <wp:extent cx="4095750" cy="1962150"/>
+            <wp:extent cx="4095750" cy="1742506"/>
             <wp:effectExtent t="0" r="0" b="0" l="0"/>
             <wp:docPr id="28" name="" descr="" title=""/>
             <wp:cNvGraphicFramePr>
@@ -4417,7 +4417,7 @@
                   <pic:spPr bwMode="auto">
                     <a:xfrm>
                       <a:off x="0" y="0"/>
-                      <a:ext cx="4095750" cy="1962150"/>
+                      <a:ext cx="4095750" cy="1742506"/>
                     </a:xfrm>
                     <a:prstGeom prst="rect">
                       <a:avLst/>
@@ -4453,7 +4453,7 @@
       <w:r>
         <w:drawing>
           <wp:inline distT="0" distB="0" distL="0" distR="0">
-            <wp:extent cx="4095750" cy="885825"/>
+            <wp:extent cx="4095750" cy="666199"/>
             <wp:effectExtent t="0" r="0" b="0" l="0"/>
             <wp:docPr id="29" name="" descr="" title=""/>
             <wp:cNvGraphicFramePr>
@@ -4478,7 +4478,7 @@
                   <pic:spPr bwMode="auto">
                     <a:xfrm>
                       <a:off x="0" y="0"/>
-                      <a:ext cx="4095750" cy="885825"/>
+                      <a:ext cx="4095750" cy="666199"/>
                     </a:xfrm>
                     <a:prstGeom prst="rect">
                       <a:avLst/>
@@ -4732,7 +4732,7 @@
       <w:r>
         <w:drawing>
           <wp:inline distT="0" distB="0" distL="0" distR="0">
-            <wp:extent cx="4095750" cy="1933575"/>
+            <wp:extent cx="4095750" cy="1817328"/>
             <wp:effectExtent t="0" r="0" b="0" l="0"/>
             <wp:docPr id="30" name="" descr="" title=""/>
             <wp:cNvGraphicFramePr>
@@ -4757,7 +4757,7 @@
                   <pic:spPr bwMode="auto">
                     <a:xfrm>
                       <a:off x="0" y="0"/>
-                      <a:ext cx="4095750" cy="1933575"/>
+                      <a:ext cx="4095750" cy="1817328"/>
                     </a:xfrm>
                     <a:prstGeom prst="rect">
                       <a:avLst/>

</xml_diff>